<commit_message>
project-front-page.aux project-front-page.docx project-front-page.fdb_latexmk project-front-page.fls project-front-page.log project-front-page.out project-front-page.pdf project-front-page.synctex.gz project-front-page.tex
</commit_message>
<xml_diff>
--- a/ipsa/project-front-page.docx
+++ b/ipsa/project-front-page.docx
@@ -64,7 +64,7 @@
           <w:sz w:val="52"/>
           <w:lang w:val="en-US"/>
         </w:rPr>
-        <w:t>5</w:t>
+        <w:t>6</w:t>
       </w:r>
       <w:r>
         <w:rPr>
@@ -236,7 +236,7 @@
                 <w:sz w:val="24"/>
                 <w:lang w:val="en-US"/>
               </w:rPr>
-              <w:t>4</w:t>
+              <w:t>5</w:t>
             </w:r>
             <w:r>
               <w:rPr>
@@ -1584,4 +1584,10 @@
     </a:ext>
   </a:extLst>
 </a:theme>
+</file>
+
+<file path=docMetadata/LabelInfo.xml><?xml version="1.0" encoding="utf-8"?>
+<clbl:labelList xmlns:clbl="http://schemas.microsoft.com/office/2020/mipLabelMetadata">
+  <clbl:label id="{61fd1d36-fecb-47ca-b7d7-d0df0370a198}" enabled="0" method="" siteId="{61fd1d36-fecb-47ca-b7d7-d0df0370a198}" removed="1"/>
+</clbl:labelList>
 </file>
</xml_diff>